<commit_message>
Add visual Gantt chart diagram and update Word report with Figure 3
</commit_message>
<xml_diff>
--- a/docs/Phase_1_Project_Report_Harsha_R_20231CSE0261.docx
+++ b/docs/Phase_1_Project_Report_Harsha_R_20231CSE0261.docx
@@ -897,7 +897,7 @@
                 <w:rFonts w:ascii="Times New Roman" w:hAnsi="Times New Roman"/>
                 <w:sz w:val="22"/>
               </w:rPr>
-              <w:t xml:space="preserve">    4.1 Work Breakdown Structure</w:t>
+              <w:t xml:space="preserve">    4.1 Work Breakdown Structure (WBS)</w:t>
             </w:r>
           </w:p>
         </w:tc>
@@ -969,6 +969,43 @@
             <w:r>
               <w:rPr>
                 <w:rFonts w:ascii="Times New Roman" w:hAnsi="Times New Roman"/>
+                <w:sz w:val="22"/>
+              </w:rPr>
+              <w:t xml:space="preserve">    4.3 Visual Project Gantt Chart</w:t>
+            </w:r>
+          </w:p>
+        </w:tc>
+        <w:tc>
+          <w:tcPr>
+            <w:tcW w:type="dxa" w:w="4513"/>
+          </w:tcPr>
+          <w:p>
+            <w:pPr>
+              <w:spacing w:line="276" w:lineRule="auto" w:after="40"/>
+              <w:jc w:val="right"/>
+            </w:pPr>
+            <w:r>
+              <w:rPr>
+                <w:rFonts w:ascii="Times New Roman" w:hAnsi="Times New Roman"/>
+                <w:sz w:val="22"/>
+              </w:rPr>
+              <w:t>17</w:t>
+            </w:r>
+          </w:p>
+        </w:tc>
+      </w:tr>
+      <w:tr>
+        <w:tc>
+          <w:tcPr>
+            <w:tcW w:type="dxa" w:w="4513"/>
+          </w:tcPr>
+          <w:p>
+            <w:pPr>
+              <w:spacing w:line="276" w:lineRule="auto" w:after="40"/>
+            </w:pPr>
+            <w:r>
+              <w:rPr>
+                <w:rFonts w:ascii="Times New Roman" w:hAnsi="Times New Roman"/>
                 <w:b/>
                 <w:color w:val="1A365D"/>
                 <w:sz w:val="22"/>
@@ -992,7 +1029,7 @@
                 <w:b/>
                 <w:sz w:val="22"/>
               </w:rPr>
-              <w:t>17</w:t>
+              <w:t>18</w:t>
             </w:r>
           </w:p>
         </w:tc>
@@ -4319,7 +4356,7 @@
               <a:graphicData uri="http://schemas.openxmlformats.org/drawingml/2006/picture">
                 <pic:pic>
                   <pic:nvPicPr>
-                    <pic:cNvPr id="0" name="fig1_architecture.png"/>
+                    <pic:cNvPr id="0" name="system_architecture.png"/>
                     <pic:cNvPicPr/>
                   </pic:nvPicPr>
                   <pic:blipFill>
@@ -5252,7 +5289,7 @@
               <a:graphicData uri="http://schemas.openxmlformats.org/drawingml/2006/picture">
                 <pic:pic>
                   <pic:nvPicPr>
-                    <pic:cNvPr id="0" name="fig2_dataflow.png"/>
+                    <pic:cNvPr id="0" name="data_flow_diagram.png"/>
                     <pic:cNvPicPr/>
                   </pic:nvPicPr>
                   <pic:blipFill>
@@ -8285,6 +8322,90 @@
       </w:r>
     </w:p>
     <w:p>
+      <w:pPr>
+        <w:keepNext/>
+        <w:spacing w:before="240" w:after="80"/>
+      </w:pPr>
+      <w:r>
+        <w:rPr>
+          <w:rFonts w:ascii="Times New Roman" w:hAnsi="Times New Roman"/>
+          <w:b/>
+          <w:color w:val="2B6CB0"/>
+          <w:sz w:val="28"/>
+        </w:rPr>
+        <w:t>4.3 Visual Project Gantt Chart</w:t>
+      </w:r>
+    </w:p>
+    <w:p>
+      <w:pPr>
+        <w:spacing w:line="360" w:lineRule="auto" w:after="120"/>
+        <w:jc w:val="both"/>
+      </w:pPr>
+      <w:r>
+        <w:rPr>
+          <w:rFonts w:ascii="Times New Roman" w:hAnsi="Times New Roman"/>
+          <w:i w:val="0"/>
+          <w:color w:val="2D3748"/>
+          <w:sz w:val="24"/>
+        </w:rPr>
+        <w:t>Figure 3 illustrates the chronological Gantt chart and milestone roadmap across all 14 project work packages for the complete 24-week lifecycle.</w:t>
+      </w:r>
+    </w:p>
+    <w:p>
+      <w:pPr>
+        <w:spacing w:before="160" w:after="80"/>
+        <w:jc w:val="center"/>
+      </w:pPr>
+      <w:r>
+        <w:drawing>
+          <wp:inline xmlns:a="http://schemas.openxmlformats.org/drawingml/2006/main" xmlns:pic="http://schemas.openxmlformats.org/drawingml/2006/picture">
+            <wp:extent cx="5303520" cy="3357274"/>
+            <wp:docPr id="3" name="Picture 3"/>
+            <wp:cNvGraphicFramePr>
+              <a:graphicFrameLocks noChangeAspect="1"/>
+            </wp:cNvGraphicFramePr>
+            <a:graphic>
+              <a:graphicData uri="http://schemas.openxmlformats.org/drawingml/2006/picture">
+                <pic:pic>
+                  <pic:nvPicPr>
+                    <pic:cNvPr id="0" name="gantt_chart.png"/>
+                    <pic:cNvPicPr/>
+                  </pic:nvPicPr>
+                  <pic:blipFill>
+                    <a:blip r:embed="rId13"/>
+                    <a:stretch>
+                      <a:fillRect/>
+                    </a:stretch>
+                  </pic:blipFill>
+                  <pic:spPr>
+                    <a:xfrm>
+                      <a:off x="0" y="0"/>
+                      <a:ext cx="5303520" cy="3357274"/>
+                    </a:xfrm>
+                    <a:prstGeom prst="rect"/>
+                  </pic:spPr>
+                </pic:pic>
+              </a:graphicData>
+            </a:graphic>
+          </wp:inline>
+        </w:drawing>
+      </w:r>
+    </w:p>
+    <w:p>
+      <w:pPr>
+        <w:spacing w:after="240"/>
+        <w:jc w:val="center"/>
+      </w:pPr>
+      <w:r>
+        <w:rPr>
+          <w:rFonts w:ascii="Times New Roman" w:hAnsi="Times New Roman"/>
+          <w:i/>
+          <w:sz w:val="20"/>
+        </w:rPr>
+        <w:t>Figure 3: Project Gantt Chart and Milestone Roadmap Across Major Project Lifecycle</w:t>
+      </w:r>
+    </w:p>
+    <w:p>
       <w:r>
         <w:br w:type="page"/>
       </w:r>

</xml_diff>

<commit_message>
Update Phase 1 timeline and Gantt chart to Aug 10 - Nov 28, 2026 schedule
</commit_message>
<xml_diff>
--- a/docs/Phase_1_Project_Report_Harsha_R_20231CSE0261.docx
+++ b/docs/Phase_1_Project_Report_Harsha_R_20231CSE0261.docx
@@ -193,9 +193,9 @@
               <w:rPr>
                 <w:b/>
                 <w:color w:val="2B6CB0"/>
-                <w:sz w:val="24"/>
+                <w:sz w:val="22"/>
               </w:rPr>
-              <w:t>Academic Year: 2026–2027</w:t>
+              <w:t>Academic Schedule: August 10, 2026 – November 28, 2026 | Academic Year: 2026–2027</w:t>
             </w:r>
           </w:p>
         </w:tc>
@@ -897,7 +897,7 @@
                 <w:rFonts w:ascii="Times New Roman" w:hAnsi="Times New Roman"/>
                 <w:sz w:val="22"/>
               </w:rPr>
-              <w:t xml:space="preserve">    4.1 Work Breakdown Structure (WBS)</w:t>
+              <w:t xml:space="preserve">    4.1 Work Breakdown Structure (WBS: Aug 10 – Nov 28, 2026)</w:t>
             </w:r>
           </w:p>
         </w:tc>
@@ -934,7 +934,7 @@
                 <w:rFonts w:ascii="Times New Roman" w:hAnsi="Times New Roman"/>
                 <w:sz w:val="22"/>
               </w:rPr>
-              <w:t xml:space="preserve">    4.2 Project Timeline &amp; Milestones</w:t>
+              <w:t xml:space="preserve">    4.2 Phase 1 Monthly Schedule &amp; Milestones</w:t>
             </w:r>
           </w:p>
         </w:tc>
@@ -5861,7 +5861,7 @@
           <w:color w:val="2B6CB0"/>
           <w:sz w:val="28"/>
         </w:rPr>
-        <w:t>4.1 Work Breakdown Structure (WBS)</w:t>
+        <w:t>4.1 Work Breakdown Structure (WBS: Aug 10 – Nov 28, 2026)</w:t>
       </w:r>
     </w:p>
     <w:p>
@@ -5876,7 +5876,7 @@
           <w:color w:val="2D3748"/>
           <w:sz w:val="24"/>
         </w:rPr>
-        <w:t>Table 3 outlines the 24-week major project lifecycle across Phase 1 (Analysis, Design &amp; Scaffolding) and Phase 2 (Implementation, Integration, Testing &amp; Defense).</w:t>
+        <w:t>Table 3 outlines the 16-week Phase 1 project lifecycle at Presidency University, spanning August 10, 2026 to November 28, 2026.</w:t>
       </w:r>
     </w:p>
     <w:tbl>
@@ -5956,7 +5956,7 @@
         </w:tc>
         <w:tc>
           <w:tcPr>
-            <w:tcW w:type="dxa" w:w="1296"/>
+            <w:tcW w:type="dxa" w:w="1584"/>
             <w:shd w:fill="1A365D"/>
             <w:tcMar>
               <w:top w:w="80" w:type="dxa"/>
@@ -5976,7 +5976,7 @@
                 <w:color w:val="FFFFFF"/>
                 <w:sz w:val="19"/>
               </w:rPr>
-              <w:t>Phase</w:t>
+              <w:t>Calendar Dates</w:t>
             </w:r>
           </w:p>
         </w:tc>
@@ -6008,7 +6008,7 @@
         </w:tc>
         <w:tc>
           <w:tcPr>
-            <w:tcW w:type="dxa" w:w="2117"/>
+            <w:tcW w:type="dxa" w:w="1829"/>
             <w:shd w:fill="1A365D"/>
             <w:tcMar>
               <w:top w:w="80" w:type="dxa"/>
@@ -6083,7 +6083,7 @@
         </w:tc>
         <w:tc>
           <w:tcPr>
-            <w:tcW w:type="dxa" w:w="1296"/>
+            <w:tcW w:type="dxa" w:w="1584"/>
             <w:tcMar>
               <w:top w:w="50" w:type="dxa"/>
               <w:bottom w:w="50" w:type="dxa"/>
@@ -6100,7 +6100,7 @@
                 <w:rFonts w:ascii="Times New Roman" w:hAnsi="Times New Roman"/>
                 <w:sz w:val="17"/>
               </w:rPr>
-              <w:t>Phase 1</w:t>
+              <w:t>Aug 10 – Aug 22, 2026</w:t>
             </w:r>
           </w:p>
         </w:tc>
@@ -6129,7 +6129,7 @@
         </w:tc>
         <w:tc>
           <w:tcPr>
-            <w:tcW w:type="dxa" w:w="2117"/>
+            <w:tcW w:type="dxa" w:w="1829"/>
             <w:tcMar>
               <w:top w:w="50" w:type="dxa"/>
               <w:bottom w:w="50" w:type="dxa"/>
@@ -6203,7 +6203,7 @@
         </w:tc>
         <w:tc>
           <w:tcPr>
-            <w:tcW w:type="dxa" w:w="1296"/>
+            <w:tcW w:type="dxa" w:w="1584"/>
             <w:shd w:fill="F7FAFC"/>
             <w:tcMar>
               <w:top w:w="50" w:type="dxa"/>
@@ -6221,7 +6221,7 @@
                 <w:rFonts w:ascii="Times New Roman" w:hAnsi="Times New Roman"/>
                 <w:sz w:val="17"/>
               </w:rPr>
-              <w:t>Phase 1</w:t>
+              <w:t>Aug 24 – Sep 12, 2026</w:t>
             </w:r>
           </w:p>
         </w:tc>
@@ -6245,13 +6245,13 @@
                 <w:rFonts w:ascii="Times New Roman" w:hAnsi="Times New Roman"/>
                 <w:sz w:val="17"/>
               </w:rPr>
-              <w:t>W2–W4</w:t>
+              <w:t>W3–W5</w:t>
             </w:r>
           </w:p>
         </w:tc>
         <w:tc>
           <w:tcPr>
-            <w:tcW w:type="dxa" w:w="2117"/>
+            <w:tcW w:type="dxa" w:w="1829"/>
             <w:shd w:fill="F7FAFC"/>
             <w:tcMar>
               <w:top w:w="50" w:type="dxa"/>
@@ -6269,7 +6269,7 @@
                 <w:rFonts w:ascii="Times New Roman" w:hAnsi="Times New Roman"/>
                 <w:sz w:val="17"/>
               </w:rPr>
-              <w:t>Literature Survey Matrix</w:t>
+              <w:t>Literature Survey Matrix (10 Papers)</w:t>
             </w:r>
           </w:p>
         </w:tc>
@@ -6324,7 +6324,7 @@
         </w:tc>
         <w:tc>
           <w:tcPr>
-            <w:tcW w:type="dxa" w:w="1296"/>
+            <w:tcW w:type="dxa" w:w="1584"/>
             <w:tcMar>
               <w:top w:w="50" w:type="dxa"/>
               <w:bottom w:w="50" w:type="dxa"/>
@@ -6341,7 +6341,7 @@
                 <w:rFonts w:ascii="Times New Roman" w:hAnsi="Times New Roman"/>
                 <w:sz w:val="17"/>
               </w:rPr>
-              <w:t>Phase 1</w:t>
+              <w:t>Sep 14 – Sep 26, 2026</w:t>
             </w:r>
           </w:p>
         </w:tc>
@@ -6364,13 +6364,13 @@
                 <w:rFonts w:ascii="Times New Roman" w:hAnsi="Times New Roman"/>
                 <w:sz w:val="17"/>
               </w:rPr>
-              <w:t>W4–W5</w:t>
+              <w:t>W6–W7</w:t>
             </w:r>
           </w:p>
         </w:tc>
         <w:tc>
           <w:tcPr>
-            <w:tcW w:type="dxa" w:w="2117"/>
+            <w:tcW w:type="dxa" w:w="1829"/>
             <w:tcMar>
               <w:top w:w="50" w:type="dxa"/>
               <w:bottom w:w="50" w:type="dxa"/>
@@ -6387,7 +6387,7 @@
                 <w:rFonts w:ascii="Times New Roman" w:hAnsi="Times New Roman"/>
                 <w:sz w:val="17"/>
               </w:rPr>
-              <w:t>SRS &amp; Privacy Framework</w:t>
+              <w:t>SRS &amp; DPDP Act 2023 Plan</w:t>
             </w:r>
           </w:p>
         </w:tc>
@@ -6438,13 +6438,13 @@
                 <w:rFonts w:ascii="Times New Roman" w:hAnsi="Times New Roman"/>
                 <w:sz w:val="17"/>
               </w:rPr>
-              <w:t>Multi-Tier Architecture &amp; DFD Design</w:t>
+              <w:t>5-Tier Architecture &amp; DFD Level 0/1 Design</w:t>
             </w:r>
           </w:p>
         </w:tc>
         <w:tc>
           <w:tcPr>
-            <w:tcW w:type="dxa" w:w="1296"/>
+            <w:tcW w:type="dxa" w:w="1584"/>
             <w:shd w:fill="F7FAFC"/>
             <w:tcMar>
               <w:top w:w="50" w:type="dxa"/>
@@ -6462,7 +6462,7 @@
                 <w:rFonts w:ascii="Times New Roman" w:hAnsi="Times New Roman"/>
                 <w:sz w:val="17"/>
               </w:rPr>
-              <w:t>Phase 1</w:t>
+              <w:t>Sep 28 – Oct 17, 2026</w:t>
             </w:r>
           </w:p>
         </w:tc>
@@ -6486,13 +6486,13 @@
                 <w:rFonts w:ascii="Times New Roman" w:hAnsi="Times New Roman"/>
                 <w:sz w:val="17"/>
               </w:rPr>
-              <w:t>W5–W7</w:t>
+              <w:t>W8–W10</w:t>
             </w:r>
           </w:p>
         </w:tc>
         <w:tc>
           <w:tcPr>
-            <w:tcW w:type="dxa" w:w="2117"/>
+            <w:tcW w:type="dxa" w:w="1829"/>
             <w:shd w:fill="F7FAFC"/>
             <w:tcMar>
               <w:top w:w="50" w:type="dxa"/>
@@ -6510,7 +6510,7 @@
                 <w:rFonts w:ascii="Times New Roman" w:hAnsi="Times New Roman"/>
                 <w:sz w:val="17"/>
               </w:rPr>
-              <w:t>Architecture Blueprint</w:t>
+              <w:t>Architecture Blueprint &amp; DFDs</w:t>
             </w:r>
           </w:p>
         </w:tc>
@@ -6565,7 +6565,7 @@
         </w:tc>
         <w:tc>
           <w:tcPr>
-            <w:tcW w:type="dxa" w:w="1296"/>
+            <w:tcW w:type="dxa" w:w="1584"/>
             <w:tcMar>
               <w:top w:w="50" w:type="dxa"/>
               <w:bottom w:w="50" w:type="dxa"/>
@@ -6582,7 +6582,7 @@
                 <w:rFonts w:ascii="Times New Roman" w:hAnsi="Times New Roman"/>
                 <w:sz w:val="17"/>
               </w:rPr>
-              <w:t>Phase 1</w:t>
+              <w:t>Oct 19 – Oct 31, 2026</w:t>
             </w:r>
           </w:p>
         </w:tc>
@@ -6605,13 +6605,13 @@
                 <w:rFonts w:ascii="Times New Roman" w:hAnsi="Times New Roman"/>
                 <w:sz w:val="17"/>
               </w:rPr>
-              <w:t>W7–W9</w:t>
+              <w:t>W11–W12</w:t>
             </w:r>
           </w:p>
         </w:tc>
         <w:tc>
           <w:tcPr>
-            <w:tcW w:type="dxa" w:w="2117"/>
+            <w:tcW w:type="dxa" w:w="1829"/>
             <w:tcMar>
               <w:top w:w="50" w:type="dxa"/>
               <w:bottom w:w="50" w:type="dxa"/>
@@ -6628,7 +6628,7 @@
                 <w:rFonts w:ascii="Times New Roman" w:hAnsi="Times New Roman"/>
                 <w:sz w:val="17"/>
               </w:rPr>
-              <w:t>Dataset Specification</w:t>
+              <w:t>Feature Vector Specification</w:t>
             </w:r>
           </w:p>
         </w:tc>
@@ -6685,7 +6685,7 @@
         </w:tc>
         <w:tc>
           <w:tcPr>
-            <w:tcW w:type="dxa" w:w="1296"/>
+            <w:tcW w:type="dxa" w:w="1584"/>
             <w:shd w:fill="F7FAFC"/>
             <w:tcMar>
               <w:top w:w="50" w:type="dxa"/>
@@ -6703,7 +6703,7 @@
                 <w:rFonts w:ascii="Times New Roman" w:hAnsi="Times New Roman"/>
                 <w:sz w:val="17"/>
               </w:rPr>
-              <w:t>Phase 1</w:t>
+              <w:t>Nov 02 – Nov 14, 2026</w:t>
             </w:r>
           </w:p>
         </w:tc>
@@ -6727,13 +6727,13 @@
                 <w:rFonts w:ascii="Times New Roman" w:hAnsi="Times New Roman"/>
                 <w:sz w:val="17"/>
               </w:rPr>
-              <w:t>W9–W10</w:t>
+              <w:t>W13–W14</w:t>
             </w:r>
           </w:p>
         </w:tc>
         <w:tc>
           <w:tcPr>
-            <w:tcW w:type="dxa" w:w="2117"/>
+            <w:tcW w:type="dxa" w:w="1829"/>
             <w:shd w:fill="F7FAFC"/>
             <w:tcMar>
               <w:top w:w="50" w:type="dxa"/>
@@ -6806,7 +6806,7 @@
         </w:tc>
         <w:tc>
           <w:tcPr>
-            <w:tcW w:type="dxa" w:w="1296"/>
+            <w:tcW w:type="dxa" w:w="1584"/>
             <w:tcMar>
               <w:top w:w="50" w:type="dxa"/>
               <w:bottom w:w="50" w:type="dxa"/>
@@ -6823,248 +6823,7 @@
                 <w:rFonts w:ascii="Times New Roman" w:hAnsi="Times New Roman"/>
                 <w:sz w:val="17"/>
               </w:rPr>
-              <w:t>Phase 1</w:t>
-            </w:r>
-          </w:p>
-        </w:tc>
-        <w:tc>
-          <w:tcPr>
-            <w:tcW w:type="dxa" w:w="1152"/>
-            <w:tcMar>
-              <w:top w:w="50" w:type="dxa"/>
-              <w:bottom w:w="50" w:type="dxa"/>
-              <w:left w:w="70" w:type="dxa"/>
-              <w:right w:w="70" w:type="dxa"/>
-            </w:tcMar>
-          </w:tcPr>
-          <w:p>
-            <w:pPr>
-              <w:spacing w:line="276" w:lineRule="auto"/>
-            </w:pPr>
-            <w:r>
-              <w:rPr>
-                <w:rFonts w:ascii="Times New Roman" w:hAnsi="Times New Roman"/>
-                <w:sz w:val="17"/>
-              </w:rPr>
-              <w:t>W11–W12</w:t>
-            </w:r>
-          </w:p>
-        </w:tc>
-        <w:tc>
-          <w:tcPr>
-            <w:tcW w:type="dxa" w:w="2117"/>
-            <w:tcMar>
-              <w:top w:w="50" w:type="dxa"/>
-              <w:bottom w:w="50" w:type="dxa"/>
-              <w:left w:w="70" w:type="dxa"/>
-              <w:right w:w="70" w:type="dxa"/>
-            </w:tcMar>
-          </w:tcPr>
-          <w:p>
-            <w:pPr>
-              <w:spacing w:line="276" w:lineRule="auto"/>
-            </w:pPr>
-            <w:r>
-              <w:rPr>
-                <w:rFonts w:ascii="Times New Roman" w:hAnsi="Times New Roman"/>
-                <w:sz w:val="17"/>
-              </w:rPr>
-              <w:t>Phase 1 Report &amp; Defense</w:t>
-            </w:r>
-          </w:p>
-        </w:tc>
-      </w:tr>
-      <w:tr>
-        <w:tc>
-          <w:tcPr>
-            <w:tcW w:type="dxa" w:w="1296"/>
-            <w:shd w:fill="F7FAFC"/>
-            <w:tcMar>
-              <w:top w:w="50" w:type="dxa"/>
-              <w:bottom w:w="50" w:type="dxa"/>
-              <w:left w:w="70" w:type="dxa"/>
-              <w:right w:w="70" w:type="dxa"/>
-            </w:tcMar>
-          </w:tcPr>
-          <w:p>
-            <w:pPr>
-              <w:spacing w:line="276" w:lineRule="auto"/>
-            </w:pPr>
-            <w:r>
-              <w:rPr>
-                <w:rFonts w:ascii="Times New Roman" w:hAnsi="Times New Roman"/>
-                <w:b/>
-                <w:sz w:val="17"/>
-              </w:rPr>
-              <w:t>T2.1</w:t>
-            </w:r>
-          </w:p>
-        </w:tc>
-        <w:tc>
-          <w:tcPr>
-            <w:tcW w:type="dxa" w:w="3168"/>
-            <w:shd w:fill="F7FAFC"/>
-            <w:tcMar>
-              <w:top w:w="50" w:type="dxa"/>
-              <w:bottom w:w="50" w:type="dxa"/>
-              <w:left w:w="70" w:type="dxa"/>
-              <w:right w:w="70" w:type="dxa"/>
-            </w:tcMar>
-          </w:tcPr>
-          <w:p>
-            <w:pPr>
-              <w:spacing w:line="276" w:lineRule="auto"/>
-            </w:pPr>
-            <w:r>
-              <w:rPr>
-                <w:rFonts w:ascii="Times New Roman" w:hAnsi="Times New Roman"/>
-                <w:sz w:val="17"/>
-              </w:rPr>
-              <w:t>Dataset Curation, Cleaning &amp; Validation</w:t>
-            </w:r>
-          </w:p>
-        </w:tc>
-        <w:tc>
-          <w:tcPr>
-            <w:tcW w:type="dxa" w:w="1296"/>
-            <w:shd w:fill="F7FAFC"/>
-            <w:tcMar>
-              <w:top w:w="50" w:type="dxa"/>
-              <w:bottom w:w="50" w:type="dxa"/>
-              <w:left w:w="70" w:type="dxa"/>
-              <w:right w:w="70" w:type="dxa"/>
-            </w:tcMar>
-          </w:tcPr>
-          <w:p>
-            <w:pPr>
-              <w:spacing w:line="276" w:lineRule="auto"/>
-            </w:pPr>
-            <w:r>
-              <w:rPr>
-                <w:rFonts w:ascii="Times New Roman" w:hAnsi="Times New Roman"/>
-                <w:sz w:val="17"/>
-              </w:rPr>
-              <w:t>Phase 2</w:t>
-            </w:r>
-          </w:p>
-        </w:tc>
-        <w:tc>
-          <w:tcPr>
-            <w:tcW w:type="dxa" w:w="1152"/>
-            <w:shd w:fill="F7FAFC"/>
-            <w:tcMar>
-              <w:top w:w="50" w:type="dxa"/>
-              <w:bottom w:w="50" w:type="dxa"/>
-              <w:left w:w="70" w:type="dxa"/>
-              <w:right w:w="70" w:type="dxa"/>
-            </w:tcMar>
-          </w:tcPr>
-          <w:p>
-            <w:pPr>
-              <w:spacing w:line="276" w:lineRule="auto"/>
-            </w:pPr>
-            <w:r>
-              <w:rPr>
-                <w:rFonts w:ascii="Times New Roman" w:hAnsi="Times New Roman"/>
-                <w:sz w:val="17"/>
-              </w:rPr>
-              <w:t>W13–W14</w:t>
-            </w:r>
-          </w:p>
-        </w:tc>
-        <w:tc>
-          <w:tcPr>
-            <w:tcW w:type="dxa" w:w="2117"/>
-            <w:shd w:fill="F7FAFC"/>
-            <w:tcMar>
-              <w:top w:w="50" w:type="dxa"/>
-              <w:bottom w:w="50" w:type="dxa"/>
-              <w:left w:w="70" w:type="dxa"/>
-              <w:right w:w="70" w:type="dxa"/>
-            </w:tcMar>
-          </w:tcPr>
-          <w:p>
-            <w:pPr>
-              <w:spacing w:line="276" w:lineRule="auto"/>
-            </w:pPr>
-            <w:r>
-              <w:rPr>
-                <w:rFonts w:ascii="Times New Roman" w:hAnsi="Times New Roman"/>
-                <w:sz w:val="17"/>
-              </w:rPr>
-              <w:t>Validated Training Dataset</w:t>
-            </w:r>
-          </w:p>
-        </w:tc>
-      </w:tr>
-      <w:tr>
-        <w:tc>
-          <w:tcPr>
-            <w:tcW w:type="dxa" w:w="1296"/>
-            <w:tcMar>
-              <w:top w:w="50" w:type="dxa"/>
-              <w:bottom w:w="50" w:type="dxa"/>
-              <w:left w:w="70" w:type="dxa"/>
-              <w:right w:w="70" w:type="dxa"/>
-            </w:tcMar>
-          </w:tcPr>
-          <w:p>
-            <w:pPr>
-              <w:spacing w:line="276" w:lineRule="auto"/>
-            </w:pPr>
-            <w:r>
-              <w:rPr>
-                <w:rFonts w:ascii="Times New Roman" w:hAnsi="Times New Roman"/>
-                <w:b/>
-                <w:sz w:val="17"/>
-              </w:rPr>
-              <w:t>T2.2</w:t>
-            </w:r>
-          </w:p>
-        </w:tc>
-        <w:tc>
-          <w:tcPr>
-            <w:tcW w:type="dxa" w:w="3168"/>
-            <w:tcMar>
-              <w:top w:w="50" w:type="dxa"/>
-              <w:bottom w:w="50" w:type="dxa"/>
-              <w:left w:w="70" w:type="dxa"/>
-              <w:right w:w="70" w:type="dxa"/>
-            </w:tcMar>
-          </w:tcPr>
-          <w:p>
-            <w:pPr>
-              <w:spacing w:line="276" w:lineRule="auto"/>
-            </w:pPr>
-            <w:r>
-              <w:rPr>
-                <w:rFonts w:ascii="Times New Roman" w:hAnsi="Times New Roman"/>
-                <w:sz w:val="17"/>
-              </w:rPr>
-              <w:t>Supervised ML Model Training &amp; Tuning</w:t>
-            </w:r>
-          </w:p>
-        </w:tc>
-        <w:tc>
-          <w:tcPr>
-            <w:tcW w:type="dxa" w:w="1296"/>
-            <w:tcMar>
-              <w:top w:w="50" w:type="dxa"/>
-              <w:bottom w:w="50" w:type="dxa"/>
-              <w:left w:w="70" w:type="dxa"/>
-              <w:right w:w="70" w:type="dxa"/>
-            </w:tcMar>
-          </w:tcPr>
-          <w:p>
-            <w:pPr>
-              <w:spacing w:line="276" w:lineRule="auto"/>
-            </w:pPr>
-            <w:r>
-              <w:rPr>
-                <w:rFonts w:ascii="Times New Roman" w:hAnsi="Times New Roman"/>
-                <w:sz w:val="17"/>
-              </w:rPr>
-              <w:t>Phase 2</w:t>
+              <w:t>Nov 16 – Nov 28, 2026</w:t>
             </w:r>
           </w:p>
         </w:tc>
@@ -7093,7 +6852,7 @@
         </w:tc>
         <w:tc>
           <w:tcPr>
-            <w:tcW w:type="dxa" w:w="2117"/>
+            <w:tcW w:type="dxa" w:w="1829"/>
             <w:tcMar>
               <w:top w:w="50" w:type="dxa"/>
               <w:bottom w:w="50" w:type="dxa"/>
@@ -7110,612 +6869,7 @@
                 <w:rFonts w:ascii="Times New Roman" w:hAnsi="Times New Roman"/>
                 <w:sz w:val="17"/>
               </w:rPr>
-              <w:t>Trained Model Artifacts</w:t>
-            </w:r>
-          </w:p>
-        </w:tc>
-      </w:tr>
-      <w:tr>
-        <w:tc>
-          <w:tcPr>
-            <w:tcW w:type="dxa" w:w="1296"/>
-            <w:shd w:fill="F7FAFC"/>
-            <w:tcMar>
-              <w:top w:w="50" w:type="dxa"/>
-              <w:bottom w:w="50" w:type="dxa"/>
-              <w:left w:w="70" w:type="dxa"/>
-              <w:right w:w="70" w:type="dxa"/>
-            </w:tcMar>
-          </w:tcPr>
-          <w:p>
-            <w:pPr>
-              <w:spacing w:line="276" w:lineRule="auto"/>
-            </w:pPr>
-            <w:r>
-              <w:rPr>
-                <w:rFonts w:ascii="Times New Roman" w:hAnsi="Times New Roman"/>
-                <w:b/>
-                <w:sz w:val="17"/>
-              </w:rPr>
-              <w:t>T2.3</w:t>
-            </w:r>
-          </w:p>
-        </w:tc>
-        <w:tc>
-          <w:tcPr>
-            <w:tcW w:type="dxa" w:w="3168"/>
-            <w:shd w:fill="F7FAFC"/>
-            <w:tcMar>
-              <w:top w:w="50" w:type="dxa"/>
-              <w:bottom w:w="50" w:type="dxa"/>
-              <w:left w:w="70" w:type="dxa"/>
-              <w:right w:w="70" w:type="dxa"/>
-            </w:tcMar>
-          </w:tcPr>
-          <w:p>
-            <w:pPr>
-              <w:spacing w:line="276" w:lineRule="auto"/>
-            </w:pPr>
-            <w:r>
-              <w:rPr>
-                <w:rFonts w:ascii="Times New Roman" w:hAnsi="Times New Roman"/>
-                <w:sz w:val="17"/>
-              </w:rPr>
-              <w:t>NLP Sentiment Engine Implementation</w:t>
-            </w:r>
-          </w:p>
-        </w:tc>
-        <w:tc>
-          <w:tcPr>
-            <w:tcW w:type="dxa" w:w="1296"/>
-            <w:shd w:fill="F7FAFC"/>
-            <w:tcMar>
-              <w:top w:w="50" w:type="dxa"/>
-              <w:bottom w:w="50" w:type="dxa"/>
-              <w:left w:w="70" w:type="dxa"/>
-              <w:right w:w="70" w:type="dxa"/>
-            </w:tcMar>
-          </w:tcPr>
-          <w:p>
-            <w:pPr>
-              <w:spacing w:line="276" w:lineRule="auto"/>
-            </w:pPr>
-            <w:r>
-              <w:rPr>
-                <w:rFonts w:ascii="Times New Roman" w:hAnsi="Times New Roman"/>
-                <w:sz w:val="17"/>
-              </w:rPr>
-              <w:t>Phase 2</w:t>
-            </w:r>
-          </w:p>
-        </w:tc>
-        <w:tc>
-          <w:tcPr>
-            <w:tcW w:type="dxa" w:w="1152"/>
-            <w:shd w:fill="F7FAFC"/>
-            <w:tcMar>
-              <w:top w:w="50" w:type="dxa"/>
-              <w:bottom w:w="50" w:type="dxa"/>
-              <w:left w:w="70" w:type="dxa"/>
-              <w:right w:w="70" w:type="dxa"/>
-            </w:tcMar>
-          </w:tcPr>
-          <w:p>
-            <w:pPr>
-              <w:spacing w:line="276" w:lineRule="auto"/>
-            </w:pPr>
-            <w:r>
-              <w:rPr>
-                <w:rFonts w:ascii="Times New Roman" w:hAnsi="Times New Roman"/>
-                <w:sz w:val="17"/>
-              </w:rPr>
-              <w:t>W17–W18</w:t>
-            </w:r>
-          </w:p>
-        </w:tc>
-        <w:tc>
-          <w:tcPr>
-            <w:tcW w:type="dxa" w:w="2117"/>
-            <w:shd w:fill="F7FAFC"/>
-            <w:tcMar>
-              <w:top w:w="50" w:type="dxa"/>
-              <w:bottom w:w="50" w:type="dxa"/>
-              <w:left w:w="70" w:type="dxa"/>
-              <w:right w:w="70" w:type="dxa"/>
-            </w:tcMar>
-          </w:tcPr>
-          <w:p>
-            <w:pPr>
-              <w:spacing w:line="276" w:lineRule="auto"/>
-            </w:pPr>
-            <w:r>
-              <w:rPr>
-                <w:rFonts w:ascii="Times New Roman" w:hAnsi="Times New Roman"/>
-                <w:sz w:val="17"/>
-              </w:rPr>
-              <w:t>Working Sentiment Module</w:t>
-            </w:r>
-          </w:p>
-        </w:tc>
-      </w:tr>
-      <w:tr>
-        <w:tc>
-          <w:tcPr>
-            <w:tcW w:type="dxa" w:w="1296"/>
-            <w:tcMar>
-              <w:top w:w="50" w:type="dxa"/>
-              <w:bottom w:w="50" w:type="dxa"/>
-              <w:left w:w="70" w:type="dxa"/>
-              <w:right w:w="70" w:type="dxa"/>
-            </w:tcMar>
-          </w:tcPr>
-          <w:p>
-            <w:pPr>
-              <w:spacing w:line="276" w:lineRule="auto"/>
-            </w:pPr>
-            <w:r>
-              <w:rPr>
-                <w:rFonts w:ascii="Times New Roman" w:hAnsi="Times New Roman"/>
-                <w:b/>
-                <w:sz w:val="17"/>
-              </w:rPr>
-              <w:t>T2.4</w:t>
-            </w:r>
-          </w:p>
-        </w:tc>
-        <w:tc>
-          <w:tcPr>
-            <w:tcW w:type="dxa" w:w="3168"/>
-            <w:tcMar>
-              <w:top w:w="50" w:type="dxa"/>
-              <w:bottom w:w="50" w:type="dxa"/>
-              <w:left w:w="70" w:type="dxa"/>
-              <w:right w:w="70" w:type="dxa"/>
-            </w:tcMar>
-          </w:tcPr>
-          <w:p>
-            <w:pPr>
-              <w:spacing w:line="276" w:lineRule="auto"/>
-            </w:pPr>
-            <w:r>
-              <w:rPr>
-                <w:rFonts w:ascii="Times New Roman" w:hAnsi="Times New Roman"/>
-                <w:sz w:val="17"/>
-              </w:rPr>
-              <w:t>Frontend Development (Child &amp; Parent UI)</w:t>
-            </w:r>
-          </w:p>
-        </w:tc>
-        <w:tc>
-          <w:tcPr>
-            <w:tcW w:type="dxa" w:w="1296"/>
-            <w:tcMar>
-              <w:top w:w="50" w:type="dxa"/>
-              <w:bottom w:w="50" w:type="dxa"/>
-              <w:left w:w="70" w:type="dxa"/>
-              <w:right w:w="70" w:type="dxa"/>
-            </w:tcMar>
-          </w:tcPr>
-          <w:p>
-            <w:pPr>
-              <w:spacing w:line="276" w:lineRule="auto"/>
-            </w:pPr>
-            <w:r>
-              <w:rPr>
-                <w:rFonts w:ascii="Times New Roman" w:hAnsi="Times New Roman"/>
-                <w:sz w:val="17"/>
-              </w:rPr>
-              <w:t>Phase 2</w:t>
-            </w:r>
-          </w:p>
-        </w:tc>
-        <w:tc>
-          <w:tcPr>
-            <w:tcW w:type="dxa" w:w="1152"/>
-            <w:tcMar>
-              <w:top w:w="50" w:type="dxa"/>
-              <w:bottom w:w="50" w:type="dxa"/>
-              <w:left w:w="70" w:type="dxa"/>
-              <w:right w:w="70" w:type="dxa"/>
-            </w:tcMar>
-          </w:tcPr>
-          <w:p>
-            <w:pPr>
-              <w:spacing w:line="276" w:lineRule="auto"/>
-            </w:pPr>
-            <w:r>
-              <w:rPr>
-                <w:rFonts w:ascii="Times New Roman" w:hAnsi="Times New Roman"/>
-                <w:sz w:val="17"/>
-              </w:rPr>
-              <w:t>W19–W20</w:t>
-            </w:r>
-          </w:p>
-        </w:tc>
-        <w:tc>
-          <w:tcPr>
-            <w:tcW w:type="dxa" w:w="2117"/>
-            <w:tcMar>
-              <w:top w:w="50" w:type="dxa"/>
-              <w:bottom w:w="50" w:type="dxa"/>
-              <w:left w:w="70" w:type="dxa"/>
-              <w:right w:w="70" w:type="dxa"/>
-            </w:tcMar>
-          </w:tcPr>
-          <w:p>
-            <w:pPr>
-              <w:spacing w:line="276" w:lineRule="auto"/>
-            </w:pPr>
-            <w:r>
-              <w:rPr>
-                <w:rFonts w:ascii="Times New Roman" w:hAnsi="Times New Roman"/>
-                <w:sz w:val="17"/>
-              </w:rPr>
-              <w:t>Multi-Role Streamlit App</w:t>
-            </w:r>
-          </w:p>
-        </w:tc>
-      </w:tr>
-      <w:tr>
-        <w:tc>
-          <w:tcPr>
-            <w:tcW w:type="dxa" w:w="1296"/>
-            <w:shd w:fill="F7FAFC"/>
-            <w:tcMar>
-              <w:top w:w="50" w:type="dxa"/>
-              <w:bottom w:w="50" w:type="dxa"/>
-              <w:left w:w="70" w:type="dxa"/>
-              <w:right w:w="70" w:type="dxa"/>
-            </w:tcMar>
-          </w:tcPr>
-          <w:p>
-            <w:pPr>
-              <w:spacing w:line="276" w:lineRule="auto"/>
-            </w:pPr>
-            <w:r>
-              <w:rPr>
-                <w:rFonts w:ascii="Times New Roman" w:hAnsi="Times New Roman"/>
-                <w:b/>
-                <w:sz w:val="17"/>
-              </w:rPr>
-              <w:t>T2.5</w:t>
-            </w:r>
-          </w:p>
-        </w:tc>
-        <w:tc>
-          <w:tcPr>
-            <w:tcW w:type="dxa" w:w="3168"/>
-            <w:shd w:fill="F7FAFC"/>
-            <w:tcMar>
-              <w:top w:w="50" w:type="dxa"/>
-              <w:bottom w:w="50" w:type="dxa"/>
-              <w:left w:w="70" w:type="dxa"/>
-              <w:right w:w="70" w:type="dxa"/>
-            </w:tcMar>
-          </w:tcPr>
-          <w:p>
-            <w:pPr>
-              <w:spacing w:line="276" w:lineRule="auto"/>
-            </w:pPr>
-            <w:r>
-              <w:rPr>
-                <w:rFonts w:ascii="Times New Roman" w:hAnsi="Times New Roman"/>
-                <w:sz w:val="17"/>
-              </w:rPr>
-              <w:t>Coping Toolkit &amp; Crisis Referral Hub</w:t>
-            </w:r>
-          </w:p>
-        </w:tc>
-        <w:tc>
-          <w:tcPr>
-            <w:tcW w:type="dxa" w:w="1296"/>
-            <w:shd w:fill="F7FAFC"/>
-            <w:tcMar>
-              <w:top w:w="50" w:type="dxa"/>
-              <w:bottom w:w="50" w:type="dxa"/>
-              <w:left w:w="70" w:type="dxa"/>
-              <w:right w:w="70" w:type="dxa"/>
-            </w:tcMar>
-          </w:tcPr>
-          <w:p>
-            <w:pPr>
-              <w:spacing w:line="276" w:lineRule="auto"/>
-            </w:pPr>
-            <w:r>
-              <w:rPr>
-                <w:rFonts w:ascii="Times New Roman" w:hAnsi="Times New Roman"/>
-                <w:sz w:val="17"/>
-              </w:rPr>
-              <w:t>Phase 2</w:t>
-            </w:r>
-          </w:p>
-        </w:tc>
-        <w:tc>
-          <w:tcPr>
-            <w:tcW w:type="dxa" w:w="1152"/>
-            <w:shd w:fill="F7FAFC"/>
-            <w:tcMar>
-              <w:top w:w="50" w:type="dxa"/>
-              <w:bottom w:w="50" w:type="dxa"/>
-              <w:left w:w="70" w:type="dxa"/>
-              <w:right w:w="70" w:type="dxa"/>
-            </w:tcMar>
-          </w:tcPr>
-          <w:p>
-            <w:pPr>
-              <w:spacing w:line="276" w:lineRule="auto"/>
-            </w:pPr>
-            <w:r>
-              <w:rPr>
-                <w:rFonts w:ascii="Times New Roman" w:hAnsi="Times New Roman"/>
-                <w:sz w:val="17"/>
-              </w:rPr>
-              <w:t>W20–W21</w:t>
-            </w:r>
-          </w:p>
-        </w:tc>
-        <w:tc>
-          <w:tcPr>
-            <w:tcW w:type="dxa" w:w="2117"/>
-            <w:shd w:fill="F7FAFC"/>
-            <w:tcMar>
-              <w:top w:w="50" w:type="dxa"/>
-              <w:bottom w:w="50" w:type="dxa"/>
-              <w:left w:w="70" w:type="dxa"/>
-              <w:right w:w="70" w:type="dxa"/>
-            </w:tcMar>
-          </w:tcPr>
-          <w:p>
-            <w:pPr>
-              <w:spacing w:line="276" w:lineRule="auto"/>
-            </w:pPr>
-            <w:r>
-              <w:rPr>
-                <w:rFonts w:ascii="Times New Roman" w:hAnsi="Times New Roman"/>
-                <w:sz w:val="17"/>
-              </w:rPr>
-              <w:t>Interactive Coping Tools</w:t>
-            </w:r>
-          </w:p>
-        </w:tc>
-      </w:tr>
-      <w:tr>
-        <w:tc>
-          <w:tcPr>
-            <w:tcW w:type="dxa" w:w="1296"/>
-            <w:tcMar>
-              <w:top w:w="50" w:type="dxa"/>
-              <w:bottom w:w="50" w:type="dxa"/>
-              <w:left w:w="70" w:type="dxa"/>
-              <w:right w:w="70" w:type="dxa"/>
-            </w:tcMar>
-          </w:tcPr>
-          <w:p>
-            <w:pPr>
-              <w:spacing w:line="276" w:lineRule="auto"/>
-            </w:pPr>
-            <w:r>
-              <w:rPr>
-                <w:rFonts w:ascii="Times New Roman" w:hAnsi="Times New Roman"/>
-                <w:b/>
-                <w:sz w:val="17"/>
-              </w:rPr>
-              <w:t>T2.6</w:t>
-            </w:r>
-          </w:p>
-        </w:tc>
-        <w:tc>
-          <w:tcPr>
-            <w:tcW w:type="dxa" w:w="3168"/>
-            <w:tcMar>
-              <w:top w:w="50" w:type="dxa"/>
-              <w:bottom w:w="50" w:type="dxa"/>
-              <w:left w:w="70" w:type="dxa"/>
-              <w:right w:w="70" w:type="dxa"/>
-            </w:tcMar>
-          </w:tcPr>
-          <w:p>
-            <w:pPr>
-              <w:spacing w:line="276" w:lineRule="auto"/>
-            </w:pPr>
-            <w:r>
-              <w:rPr>
-                <w:rFonts w:ascii="Times New Roman" w:hAnsi="Times New Roman"/>
-                <w:sz w:val="17"/>
-              </w:rPr>
-              <w:t>System Integration &amp; Usability Testing</w:t>
-            </w:r>
-          </w:p>
-        </w:tc>
-        <w:tc>
-          <w:tcPr>
-            <w:tcW w:type="dxa" w:w="1296"/>
-            <w:tcMar>
-              <w:top w:w="50" w:type="dxa"/>
-              <w:bottom w:w="50" w:type="dxa"/>
-              <w:left w:w="70" w:type="dxa"/>
-              <w:right w:w="70" w:type="dxa"/>
-            </w:tcMar>
-          </w:tcPr>
-          <w:p>
-            <w:pPr>
-              <w:spacing w:line="276" w:lineRule="auto"/>
-            </w:pPr>
-            <w:r>
-              <w:rPr>
-                <w:rFonts w:ascii="Times New Roman" w:hAnsi="Times New Roman"/>
-                <w:sz w:val="17"/>
-              </w:rPr>
-              <w:t>Phase 2</w:t>
-            </w:r>
-          </w:p>
-        </w:tc>
-        <w:tc>
-          <w:tcPr>
-            <w:tcW w:type="dxa" w:w="1152"/>
-            <w:tcMar>
-              <w:top w:w="50" w:type="dxa"/>
-              <w:bottom w:w="50" w:type="dxa"/>
-              <w:left w:w="70" w:type="dxa"/>
-              <w:right w:w="70" w:type="dxa"/>
-            </w:tcMar>
-          </w:tcPr>
-          <w:p>
-            <w:pPr>
-              <w:spacing w:line="276" w:lineRule="auto"/>
-            </w:pPr>
-            <w:r>
-              <w:rPr>
-                <w:rFonts w:ascii="Times New Roman" w:hAnsi="Times New Roman"/>
-                <w:sz w:val="17"/>
-              </w:rPr>
-              <w:t>W21–W22</w:t>
-            </w:r>
-          </w:p>
-        </w:tc>
-        <w:tc>
-          <w:tcPr>
-            <w:tcW w:type="dxa" w:w="2117"/>
-            <w:tcMar>
-              <w:top w:w="50" w:type="dxa"/>
-              <w:bottom w:w="50" w:type="dxa"/>
-              <w:left w:w="70" w:type="dxa"/>
-              <w:right w:w="70" w:type="dxa"/>
-            </w:tcMar>
-          </w:tcPr>
-          <w:p>
-            <w:pPr>
-              <w:spacing w:line="276" w:lineRule="auto"/>
-            </w:pPr>
-            <w:r>
-              <w:rPr>
-                <w:rFonts w:ascii="Times New Roman" w:hAnsi="Times New Roman"/>
-                <w:sz w:val="17"/>
-              </w:rPr>
-              <w:t>Integration Test Logs</w:t>
-            </w:r>
-          </w:p>
-        </w:tc>
-      </w:tr>
-      <w:tr>
-        <w:tc>
-          <w:tcPr>
-            <w:tcW w:type="dxa" w:w="1296"/>
-            <w:shd w:fill="F7FAFC"/>
-            <w:tcMar>
-              <w:top w:w="50" w:type="dxa"/>
-              <w:bottom w:w="50" w:type="dxa"/>
-              <w:left w:w="70" w:type="dxa"/>
-              <w:right w:w="70" w:type="dxa"/>
-            </w:tcMar>
-          </w:tcPr>
-          <w:p>
-            <w:pPr>
-              <w:spacing w:line="276" w:lineRule="auto"/>
-            </w:pPr>
-            <w:r>
-              <w:rPr>
-                <w:rFonts w:ascii="Times New Roman" w:hAnsi="Times New Roman"/>
-                <w:b/>
-                <w:sz w:val="17"/>
-              </w:rPr>
-              <w:t>T2.7</w:t>
-            </w:r>
-          </w:p>
-        </w:tc>
-        <w:tc>
-          <w:tcPr>
-            <w:tcW w:type="dxa" w:w="3168"/>
-            <w:shd w:fill="F7FAFC"/>
-            <w:tcMar>
-              <w:top w:w="50" w:type="dxa"/>
-              <w:bottom w:w="50" w:type="dxa"/>
-              <w:left w:w="70" w:type="dxa"/>
-              <w:right w:w="70" w:type="dxa"/>
-            </w:tcMar>
-          </w:tcPr>
-          <w:p>
-            <w:pPr>
-              <w:spacing w:line="276" w:lineRule="auto"/>
-            </w:pPr>
-            <w:r>
-              <w:rPr>
-                <w:rFonts w:ascii="Times New Roman" w:hAnsi="Times New Roman"/>
-                <w:sz w:val="17"/>
-              </w:rPr>
-              <w:t>Final Project Thesis &amp; Major Defense</w:t>
-            </w:r>
-          </w:p>
-        </w:tc>
-        <w:tc>
-          <w:tcPr>
-            <w:tcW w:type="dxa" w:w="1296"/>
-            <w:shd w:fill="F7FAFC"/>
-            <w:tcMar>
-              <w:top w:w="50" w:type="dxa"/>
-              <w:bottom w:w="50" w:type="dxa"/>
-              <w:left w:w="70" w:type="dxa"/>
-              <w:right w:w="70" w:type="dxa"/>
-            </w:tcMar>
-          </w:tcPr>
-          <w:p>
-            <w:pPr>
-              <w:spacing w:line="276" w:lineRule="auto"/>
-            </w:pPr>
-            <w:r>
-              <w:rPr>
-                <w:rFonts w:ascii="Times New Roman" w:hAnsi="Times New Roman"/>
-                <w:sz w:val="17"/>
-              </w:rPr>
-              <w:t>Phase 2</w:t>
-            </w:r>
-          </w:p>
-        </w:tc>
-        <w:tc>
-          <w:tcPr>
-            <w:tcW w:type="dxa" w:w="1152"/>
-            <w:shd w:fill="F7FAFC"/>
-            <w:tcMar>
-              <w:top w:w="50" w:type="dxa"/>
-              <w:bottom w:w="50" w:type="dxa"/>
-              <w:left w:w="70" w:type="dxa"/>
-              <w:right w:w="70" w:type="dxa"/>
-            </w:tcMar>
-          </w:tcPr>
-          <w:p>
-            <w:pPr>
-              <w:spacing w:line="276" w:lineRule="auto"/>
-            </w:pPr>
-            <w:r>
-              <w:rPr>
-                <w:rFonts w:ascii="Times New Roman" w:hAnsi="Times New Roman"/>
-                <w:sz w:val="17"/>
-              </w:rPr>
-              <w:t>W23–W24</w:t>
-            </w:r>
-          </w:p>
-        </w:tc>
-        <w:tc>
-          <w:tcPr>
-            <w:tcW w:type="dxa" w:w="2117"/>
-            <w:shd w:fill="F7FAFC"/>
-            <w:tcMar>
-              <w:top w:w="50" w:type="dxa"/>
-              <w:bottom w:w="50" w:type="dxa"/>
-              <w:left w:w="70" w:type="dxa"/>
-              <w:right w:w="70" w:type="dxa"/>
-            </w:tcMar>
-          </w:tcPr>
-          <w:p>
-            <w:pPr>
-              <w:spacing w:line="276" w:lineRule="auto"/>
-            </w:pPr>
-            <w:r>
-              <w:rPr>
-                <w:rFonts w:ascii="Times New Roman" w:hAnsi="Times New Roman"/>
-                <w:sz w:val="17"/>
-              </w:rPr>
-              <w:t>Final B.Tech Thesis &amp; Demo</w:t>
+              <w:t>Phase 1 Report &amp; Defense (★)</w:t>
             </w:r>
           </w:p>
         </w:tc>
@@ -7732,7 +6886,7 @@
           <w:i/>
           <w:sz w:val="20"/>
         </w:rPr>
-        <w:t>Table 3: Work Breakdown Structure (WBS) Across Major Project Lifecycle</w:t>
+        <w:t>Table 3: Work Breakdown Structure (WBS) for Phase 1 (August 10 – November 28, 2026)</w:t>
       </w:r>
     </w:p>
     <w:p>
@@ -7747,7 +6901,7 @@
           <w:color w:val="2B6CB0"/>
           <w:sz w:val="28"/>
         </w:rPr>
-        <w:t>4.2 Project Timeline &amp; Milestones</w:t>
+        <w:t>4.2 Phase 1 Monthly Schedule &amp; Milestones</w:t>
       </w:r>
     </w:p>
     <w:p>
@@ -7762,7 +6916,7 @@
           <w:color w:val="2D3748"/>
           <w:sz w:val="24"/>
         </w:rPr>
-        <w:t>Table 4 outlines the sequential academic milestones across the six-month project schedule.</w:t>
+        <w:t>Table 4 outlines the monthly milestones across the 16-week Phase 1 timeline at Presidency University.</w:t>
       </w:r>
     </w:p>
     <w:tbl>
@@ -7886,7 +7040,7 @@
                 <w:b/>
                 <w:sz w:val="18"/>
               </w:rPr>
-              <w:t>Month 1 (Weeks 1–4)</w:t>
+              <w:t>August 2026 (Weeks 1–3)</w:t>
             </w:r>
           </w:p>
         </w:tc>
@@ -7909,7 +7063,7 @@
                 <w:rFonts w:ascii="Times New Roman" w:hAnsi="Times New Roman"/>
                 <w:sz w:val="18"/>
               </w:rPr>
-              <w:t>Literature Review &amp; Problem Definition</w:t>
+              <w:t>Problem Formulation &amp; Literature Review Inception</w:t>
             </w:r>
           </w:p>
         </w:tc>
@@ -7932,7 +7086,7 @@
                 <w:rFonts w:ascii="Times New Roman" w:hAnsi="Times New Roman"/>
                 <w:sz w:val="18"/>
               </w:rPr>
-              <w:t>Comprehensive Literature Survey Matrix</w:t>
+              <w:t>Problem Statement &amp; Initial Survey</w:t>
             </w:r>
           </w:p>
         </w:tc>
@@ -7959,7 +7113,7 @@
                 <w:b/>
                 <w:sz w:val="18"/>
               </w:rPr>
-              <w:t>Month 2 (Weeks 5–8)</w:t>
+              <w:t>September 2026 (Weeks 4–7)</w:t>
             </w:r>
           </w:p>
         </w:tc>
@@ -7983,7 +7137,7 @@
                 <w:rFonts w:ascii="Times New Roman" w:hAnsi="Times New Roman"/>
                 <w:sz w:val="18"/>
               </w:rPr>
-              <w:t>Architecture Design &amp; Privacy Framework</w:t>
+              <w:t>Literature Review Finalization &amp; SRS/Privacy Modeling</w:t>
             </w:r>
           </w:p>
         </w:tc>
@@ -8007,7 +7161,7 @@
                 <w:rFonts w:ascii="Times New Roman" w:hAnsi="Times New Roman"/>
                 <w:sz w:val="18"/>
               </w:rPr>
-              <w:t>5-Tier Architecture Blueprint &amp; DFD Specifications</w:t>
+              <w:t>Literature Survey Matrix &amp; DPDP Act Plan</w:t>
             </w:r>
           </w:p>
         </w:tc>
@@ -8033,7 +7187,7 @@
                 <w:b/>
                 <w:sz w:val="18"/>
               </w:rPr>
-              <w:t>Month 3 (Weeks 9–12)</w:t>
+              <w:t>October 2026 (Weeks 8–12)</w:t>
             </w:r>
           </w:p>
         </w:tc>
@@ -8056,7 +7210,7 @@
                 <w:rFonts w:ascii="Times New Roman" w:hAnsi="Times New Roman"/>
                 <w:sz w:val="18"/>
               </w:rPr>
-              <w:t>Phase 1 Evaluation &amp; Defense</w:t>
+              <w:t>5-Tier Architecture, DFD Modeling &amp; Feature Schema</w:t>
             </w:r>
           </w:p>
         </w:tc>
@@ -8079,7 +7233,7 @@
                 <w:rFonts w:ascii="Times New Roman" w:hAnsi="Times New Roman"/>
                 <w:sz w:val="18"/>
               </w:rPr>
-              <w:t>Phase 1 Project Report &amp; Interim Presentation</w:t>
+              <w:t>Architecture Blueprint &amp; Dataset Spec</w:t>
             </w:r>
           </w:p>
         </w:tc>
@@ -8106,7 +7260,7 @@
                 <w:b/>
                 <w:sz w:val="18"/>
               </w:rPr>
-              <w:t>Month 4 (Weeks 13–16)</w:t>
+              <w:t>November 2026 (Weeks 13–16)</w:t>
             </w:r>
           </w:p>
         </w:tc>
@@ -8130,7 +7284,7 @@
                 <w:rFonts w:ascii="Times New Roman" w:hAnsi="Times New Roman"/>
                 <w:sz w:val="18"/>
               </w:rPr>
-              <w:t>Dataset Curation &amp; ML Model Training</w:t>
+              <w:t>Pipeline Verification, Report Finalization &amp; Defense</w:t>
             </w:r>
           </w:p>
         </w:tc>
@@ -8154,154 +7308,7 @@
                 <w:rFonts w:ascii="Times New Roman" w:hAnsi="Times New Roman"/>
                 <w:sz w:val="18"/>
               </w:rPr>
-              <w:t>Trained Multi-Class Classifiers &amp; Scaler Artifacts</w:t>
-            </w:r>
-          </w:p>
-        </w:tc>
-      </w:tr>
-      <w:tr>
-        <w:tc>
-          <w:tcPr>
-            <w:tcW w:type="dxa" w:w="2160"/>
-            <w:tcMar>
-              <w:top w:w="60" w:type="dxa"/>
-              <w:bottom w:w="60" w:type="dxa"/>
-              <w:left w:w="80" w:type="dxa"/>
-              <w:right w:w="80" w:type="dxa"/>
-            </w:tcMar>
-          </w:tcPr>
-          <w:p>
-            <w:pPr>
-              <w:spacing w:line="276" w:lineRule="auto"/>
-            </w:pPr>
-            <w:r>
-              <w:rPr>
-                <w:rFonts w:ascii="Times New Roman" w:hAnsi="Times New Roman"/>
-                <w:b/>
-                <w:sz w:val="18"/>
-              </w:rPr>
-              <w:t>Month 5 (Weeks 17–20)</w:t>
-            </w:r>
-          </w:p>
-        </w:tc>
-        <w:tc>
-          <w:tcPr>
-            <w:tcW w:type="dxa" w:w="3312"/>
-            <w:tcMar>
-              <w:top w:w="60" w:type="dxa"/>
-              <w:bottom w:w="60" w:type="dxa"/>
-              <w:left w:w="80" w:type="dxa"/>
-              <w:right w:w="80" w:type="dxa"/>
-            </w:tcMar>
-          </w:tcPr>
-          <w:p>
-            <w:pPr>
-              <w:spacing w:line="276" w:lineRule="auto"/>
-            </w:pPr>
-            <w:r>
-              <w:rPr>
-                <w:rFonts w:ascii="Times New Roman" w:hAnsi="Times New Roman"/>
-                <w:sz w:val="18"/>
-              </w:rPr>
-              <w:t>NLP Sentiment Engine &amp; UI Integration</w:t>
-            </w:r>
-          </w:p>
-        </w:tc>
-        <w:tc>
-          <w:tcPr>
-            <w:tcW w:type="dxa" w:w="3557"/>
-            <w:tcMar>
-              <w:top w:w="60" w:type="dxa"/>
-              <w:bottom w:w="60" w:type="dxa"/>
-              <w:left w:w="80" w:type="dxa"/>
-              <w:right w:w="80" w:type="dxa"/>
-            </w:tcMar>
-          </w:tcPr>
-          <w:p>
-            <w:pPr>
-              <w:spacing w:line="276" w:lineRule="auto"/>
-            </w:pPr>
-            <w:r>
-              <w:rPr>
-                <w:rFonts w:ascii="Times New Roman" w:hAnsi="Times New Roman"/>
-                <w:sz w:val="18"/>
-              </w:rPr>
-              <w:t>Fully Integrated Streamlit Platform (app.py)</w:t>
-            </w:r>
-          </w:p>
-        </w:tc>
-      </w:tr>
-      <w:tr>
-        <w:tc>
-          <w:tcPr>
-            <w:tcW w:type="dxa" w:w="2160"/>
-            <w:shd w:fill="F7FAFC"/>
-            <w:tcMar>
-              <w:top w:w="60" w:type="dxa"/>
-              <w:bottom w:w="60" w:type="dxa"/>
-              <w:left w:w="80" w:type="dxa"/>
-              <w:right w:w="80" w:type="dxa"/>
-            </w:tcMar>
-          </w:tcPr>
-          <w:p>
-            <w:pPr>
-              <w:spacing w:line="276" w:lineRule="auto"/>
-            </w:pPr>
-            <w:r>
-              <w:rPr>
-                <w:rFonts w:ascii="Times New Roman" w:hAnsi="Times New Roman"/>
-                <w:b/>
-                <w:sz w:val="18"/>
-              </w:rPr>
-              <w:t>Month 6 (Weeks 21–24)</w:t>
-            </w:r>
-          </w:p>
-        </w:tc>
-        <w:tc>
-          <w:tcPr>
-            <w:tcW w:type="dxa" w:w="3312"/>
-            <w:shd w:fill="F7FAFC"/>
-            <w:tcMar>
-              <w:top w:w="60" w:type="dxa"/>
-              <w:bottom w:w="60" w:type="dxa"/>
-              <w:left w:w="80" w:type="dxa"/>
-              <w:right w:w="80" w:type="dxa"/>
-            </w:tcMar>
-          </w:tcPr>
-          <w:p>
-            <w:pPr>
-              <w:spacing w:line="276" w:lineRule="auto"/>
-            </w:pPr>
-            <w:r>
-              <w:rPr>
-                <w:rFonts w:ascii="Times New Roman" w:hAnsi="Times New Roman"/>
-                <w:sz w:val="18"/>
-              </w:rPr>
-              <w:t>Final Evaluation &amp; Thesis Defense</w:t>
-            </w:r>
-          </w:p>
-        </w:tc>
-        <w:tc>
-          <w:tcPr>
-            <w:tcW w:type="dxa" w:w="3557"/>
-            <w:shd w:fill="F7FAFC"/>
-            <w:tcMar>
-              <w:top w:w="60" w:type="dxa"/>
-              <w:bottom w:w="60" w:type="dxa"/>
-              <w:left w:w="80" w:type="dxa"/>
-              <w:right w:w="80" w:type="dxa"/>
-            </w:tcMar>
-          </w:tcPr>
-          <w:p>
-            <w:pPr>
-              <w:spacing w:line="276" w:lineRule="auto"/>
-            </w:pPr>
-            <w:r>
-              <w:rPr>
-                <w:rFonts w:ascii="Times New Roman" w:hAnsi="Times New Roman"/>
-                <w:sz w:val="18"/>
-              </w:rPr>
-              <w:t>Final B.Tech Thesis, Working Demo &amp; Viva Voce</w:t>
+              <w:t>Phase 1 Report (.docx) &amp; Project Defense (★)</w:t>
             </w:r>
           </w:p>
         </w:tc>
@@ -8318,7 +7325,7 @@
           <w:i/>
           <w:sz w:val="20"/>
         </w:rPr>
-        <w:t>Table 4: Monthly Milestone Schedule and Tangible Deliverables</w:t>
+        <w:t>Table 4: Phase 1 Monthly Milestone Schedule and Tangible Deliverables</w:t>
       </w:r>
     </w:p>
     <w:p>
@@ -8348,7 +7355,7 @@
           <w:color w:val="2D3748"/>
           <w:sz w:val="24"/>
         </w:rPr>
-        <w:t>Figure 3 illustrates the chronological Gantt chart and milestone roadmap across all 14 project work packages for the complete 24-week lifecycle.</w:t>
+        <w:t>Figure 3 illustrates the chronological Gantt chart and milestone roadmap for Phase 1 spanning August 10, 2026 to November 28, 2026.</w:t>
       </w:r>
     </w:p>
     <w:p>
@@ -8359,7 +7366,7 @@
       <w:r>
         <w:drawing>
           <wp:inline xmlns:a="http://schemas.openxmlformats.org/drawingml/2006/main" xmlns:pic="http://schemas.openxmlformats.org/drawingml/2006/picture">
-            <wp:extent cx="5303520" cy="3357274"/>
+            <wp:extent cx="5303520" cy="3088492"/>
             <wp:docPr id="3" name="Picture 3"/>
             <wp:cNvGraphicFramePr>
               <a:graphicFrameLocks noChangeAspect="1"/>
@@ -8380,7 +7387,7 @@
                   <pic:spPr>
                     <a:xfrm>
                       <a:off x="0" y="0"/>
-                      <a:ext cx="5303520" cy="3357274"/>
+                      <a:ext cx="5303520" cy="3088492"/>
                     </a:xfrm>
                     <a:prstGeom prst="rect"/>
                   </pic:spPr>
@@ -8402,7 +7409,7 @@
           <w:i/>
           <w:sz w:val="20"/>
         </w:rPr>
-        <w:t>Figure 3: Project Gantt Chart and Milestone Roadmap Across Major Project Lifecycle</w:t>
+        <w:t>Figure 3: Phase 1 Project Gantt Chart (August 10 – November 28, 2026)</w:t>
       </w:r>
     </w:p>
     <w:p>

</xml_diff>